<commit_message>
Clean up temp files and ignore rules
</commit_message>
<xml_diff>
--- a/PotholeWatch_White_Paper_v8_Final.docx
+++ b/PotholeWatch_White_Paper_v8_Final.docx
@@ -93,12 +93,6 @@
         <w:gridCol w:w="8996"/>
       </w:tblGrid>
       <w:tr>
-        <w:tblPrEx>
-          <w:tblCellMar>
-            <w:top w:w="0" w:type="dxa"/>
-            <w:bottom w:w="0" w:type="dxa"/>
-          </w:tblCellMar>
-        </w:tblPrEx>
         <w:tc>
           <w:tcPr>
             <w:tcW w:w="9360" w:type="dxa"/>
@@ -228,7 +222,7 @@
               <w:rPr>
                 <w:noProof/>
               </w:rPr>
-              <w:t>1</w:t>
+              <w:t>4</w:t>
             </w:r>
             <w:r>
               <w:rPr>
@@ -289,7 +283,7 @@
               <w:rPr>
                 <w:noProof/>
               </w:rPr>
-              <w:t>1</w:t>
+              <w:t>4</w:t>
             </w:r>
             <w:r>
               <w:rPr>
@@ -350,7 +344,7 @@
               <w:rPr>
                 <w:noProof/>
               </w:rPr>
-              <w:t>1</w:t>
+              <w:t>4</w:t>
             </w:r>
             <w:r>
               <w:rPr>
@@ -411,7 +405,7 @@
               <w:rPr>
                 <w:noProof/>
               </w:rPr>
-              <w:t>1</w:t>
+              <w:t>4</w:t>
             </w:r>
             <w:r>
               <w:rPr>
@@ -472,7 +466,7 @@
               <w:rPr>
                 <w:noProof/>
               </w:rPr>
-              <w:t>1</w:t>
+              <w:t>4</w:t>
             </w:r>
             <w:r>
               <w:rPr>
@@ -533,7 +527,7 @@
               <w:rPr>
                 <w:noProof/>
               </w:rPr>
-              <w:t>1</w:t>
+              <w:t>4</w:t>
             </w:r>
             <w:r>
               <w:rPr>
@@ -594,7 +588,7 @@
               <w:rPr>
                 <w:noProof/>
               </w:rPr>
-              <w:t>1</w:t>
+              <w:t>5</w:t>
             </w:r>
             <w:r>
               <w:rPr>
@@ -655,7 +649,7 @@
               <w:rPr>
                 <w:noProof/>
               </w:rPr>
-              <w:t>1</w:t>
+              <w:t>5</w:t>
             </w:r>
             <w:r>
               <w:rPr>
@@ -716,7 +710,7 @@
               <w:rPr>
                 <w:noProof/>
               </w:rPr>
-              <w:t>1</w:t>
+              <w:t>5</w:t>
             </w:r>
             <w:r>
               <w:rPr>
@@ -777,7 +771,7 @@
               <w:rPr>
                 <w:noProof/>
               </w:rPr>
-              <w:t>1</w:t>
+              <w:t>5</w:t>
             </w:r>
             <w:r>
               <w:rPr>
@@ -838,7 +832,7 @@
               <w:rPr>
                 <w:noProof/>
               </w:rPr>
-              <w:t>1</w:t>
+              <w:t>5</w:t>
             </w:r>
             <w:r>
               <w:rPr>
@@ -899,7 +893,7 @@
               <w:rPr>
                 <w:noProof/>
               </w:rPr>
-              <w:t>1</w:t>
+              <w:t>5</w:t>
             </w:r>
             <w:r>
               <w:rPr>
@@ -960,7 +954,7 @@
               <w:rPr>
                 <w:noProof/>
               </w:rPr>
-              <w:t>1</w:t>
+              <w:t>6</w:t>
             </w:r>
             <w:r>
               <w:rPr>
@@ -1021,7 +1015,7 @@
               <w:rPr>
                 <w:noProof/>
               </w:rPr>
-              <w:t>1</w:t>
+              <w:t>6</w:t>
             </w:r>
             <w:r>
               <w:rPr>
@@ -1082,7 +1076,7 @@
               <w:rPr>
                 <w:noProof/>
               </w:rPr>
-              <w:t>1</w:t>
+              <w:t>7</w:t>
             </w:r>
             <w:r>
               <w:rPr>
@@ -1143,7 +1137,7 @@
               <w:rPr>
                 <w:noProof/>
               </w:rPr>
-              <w:t>1</w:t>
+              <w:t>7</w:t>
             </w:r>
             <w:r>
               <w:rPr>
@@ -1204,7 +1198,7 @@
               <w:rPr>
                 <w:noProof/>
               </w:rPr>
-              <w:t>1</w:t>
+              <w:t>7</w:t>
             </w:r>
             <w:r>
               <w:rPr>
@@ -1265,7 +1259,7 @@
               <w:rPr>
                 <w:noProof/>
               </w:rPr>
-              <w:t>1</w:t>
+              <w:t>8</w:t>
             </w:r>
             <w:r>
               <w:rPr>
@@ -1326,7 +1320,7 @@
               <w:rPr>
                 <w:noProof/>
               </w:rPr>
-              <w:t>1</w:t>
+              <w:t>8</w:t>
             </w:r>
             <w:r>
               <w:rPr>
@@ -1387,7 +1381,7 @@
               <w:rPr>
                 <w:noProof/>
               </w:rPr>
-              <w:t>1</w:t>
+              <w:t>8</w:t>
             </w:r>
             <w:r>
               <w:rPr>
@@ -1448,7 +1442,7 @@
               <w:rPr>
                 <w:noProof/>
               </w:rPr>
-              <w:t>1</w:t>
+              <w:t>8</w:t>
             </w:r>
             <w:r>
               <w:rPr>
@@ -1509,7 +1503,7 @@
               <w:rPr>
                 <w:noProof/>
               </w:rPr>
-              <w:t>1</w:t>
+              <w:t>8</w:t>
             </w:r>
             <w:r>
               <w:rPr>
@@ -1570,7 +1564,7 @@
               <w:rPr>
                 <w:noProof/>
               </w:rPr>
-              <w:t>1</w:t>
+              <w:t>9</w:t>
             </w:r>
             <w:r>
               <w:rPr>
@@ -1631,7 +1625,7 @@
               <w:rPr>
                 <w:noProof/>
               </w:rPr>
-              <w:t>1</w:t>
+              <w:t>9</w:t>
             </w:r>
             <w:r>
               <w:rPr>
@@ -1692,7 +1686,7 @@
               <w:rPr>
                 <w:noProof/>
               </w:rPr>
-              <w:t>1</w:t>
+              <w:t>9</w:t>
             </w:r>
             <w:r>
               <w:rPr>
@@ -1753,7 +1747,7 @@
               <w:rPr>
                 <w:noProof/>
               </w:rPr>
-              <w:t>1</w:t>
+              <w:t>10</w:t>
             </w:r>
             <w:r>
               <w:rPr>
@@ -1814,7 +1808,7 @@
               <w:rPr>
                 <w:noProof/>
               </w:rPr>
-              <w:t>1</w:t>
+              <w:t>10</w:t>
             </w:r>
             <w:r>
               <w:rPr>
@@ -1875,7 +1869,7 @@
               <w:rPr>
                 <w:noProof/>
               </w:rPr>
-              <w:t>1</w:t>
+              <w:t>10</w:t>
             </w:r>
             <w:r>
               <w:rPr>
@@ -1936,7 +1930,7 @@
               <w:rPr>
                 <w:noProof/>
               </w:rPr>
-              <w:t>1</w:t>
+              <w:t>10</w:t>
             </w:r>
             <w:r>
               <w:rPr>
@@ -1997,7 +1991,7 @@
               <w:rPr>
                 <w:noProof/>
               </w:rPr>
-              <w:t>1</w:t>
+              <w:t>10</w:t>
             </w:r>
             <w:r>
               <w:rPr>
@@ -2058,7 +2052,7 @@
               <w:rPr>
                 <w:noProof/>
               </w:rPr>
-              <w:t>1</w:t>
+              <w:t>11</w:t>
             </w:r>
             <w:r>
               <w:rPr>
@@ -2119,7 +2113,7 @@
               <w:rPr>
                 <w:noProof/>
               </w:rPr>
-              <w:t>1</w:t>
+              <w:t>11</w:t>
             </w:r>
             <w:r>
               <w:rPr>
@@ -2180,7 +2174,7 @@
               <w:rPr>
                 <w:noProof/>
               </w:rPr>
-              <w:t>1</w:t>
+              <w:t>12</w:t>
             </w:r>
             <w:r>
               <w:rPr>
@@ -2241,7 +2235,7 @@
               <w:rPr>
                 <w:noProof/>
               </w:rPr>
-              <w:t>1</w:t>
+              <w:t>12</w:t>
             </w:r>
             <w:r>
               <w:rPr>
@@ -2302,7 +2296,7 @@
               <w:rPr>
                 <w:noProof/>
               </w:rPr>
-              <w:t>1</w:t>
+              <w:t>12</w:t>
             </w:r>
             <w:r>
               <w:rPr>
@@ -2363,7 +2357,7 @@
               <w:rPr>
                 <w:noProof/>
               </w:rPr>
-              <w:t>1</w:t>
+              <w:t>12</w:t>
             </w:r>
             <w:r>
               <w:rPr>
@@ -2424,7 +2418,7 @@
               <w:rPr>
                 <w:noProof/>
               </w:rPr>
-              <w:t>1</w:t>
+              <w:t>13</w:t>
             </w:r>
             <w:r>
               <w:rPr>
@@ -2485,7 +2479,7 @@
               <w:rPr>
                 <w:noProof/>
               </w:rPr>
-              <w:t>1</w:t>
+              <w:t>13</w:t>
             </w:r>
             <w:r>
               <w:rPr>
@@ -2546,7 +2540,7 @@
               <w:rPr>
                 <w:noProof/>
               </w:rPr>
-              <w:t>1</w:t>
+              <w:t>13</w:t>
             </w:r>
             <w:r>
               <w:rPr>
@@ -2607,7 +2601,7 @@
               <w:rPr>
                 <w:noProof/>
               </w:rPr>
-              <w:t>1</w:t>
+              <w:t>13</w:t>
             </w:r>
             <w:r>
               <w:rPr>
@@ -2668,7 +2662,7 @@
               <w:rPr>
                 <w:noProof/>
               </w:rPr>
-              <w:t>1</w:t>
+              <w:t>13</w:t>
             </w:r>
             <w:r>
               <w:rPr>
@@ -2729,7 +2723,7 @@
               <w:rPr>
                 <w:noProof/>
               </w:rPr>
-              <w:t>1</w:t>
+              <w:t>13</w:t>
             </w:r>
             <w:r>
               <w:rPr>
@@ -2790,7 +2784,7 @@
               <w:rPr>
                 <w:noProof/>
               </w:rPr>
-              <w:t>1</w:t>
+              <w:t>13</w:t>
             </w:r>
             <w:r>
               <w:rPr>
@@ -2851,7 +2845,7 @@
               <w:rPr>
                 <w:noProof/>
               </w:rPr>
-              <w:t>1</w:t>
+              <w:t>13</w:t>
             </w:r>
             <w:r>
               <w:rPr>
@@ -2912,7 +2906,7 @@
               <w:rPr>
                 <w:noProof/>
               </w:rPr>
-              <w:t>1</w:t>
+              <w:t>14</w:t>
             </w:r>
             <w:r>
               <w:rPr>
@@ -2973,7 +2967,7 @@
               <w:rPr>
                 <w:noProof/>
               </w:rPr>
-              <w:t>1</w:t>
+              <w:t>14</w:t>
             </w:r>
             <w:r>
               <w:rPr>
@@ -3034,7 +3028,7 @@
               <w:rPr>
                 <w:noProof/>
               </w:rPr>
-              <w:t>1</w:t>
+              <w:t>14</w:t>
             </w:r>
             <w:r>
               <w:rPr>
@@ -3095,7 +3089,7 @@
               <w:rPr>
                 <w:noProof/>
               </w:rPr>
-              <w:t>1</w:t>
+              <w:t>14</w:t>
             </w:r>
             <w:r>
               <w:rPr>
@@ -3156,7 +3150,7 @@
               <w:rPr>
                 <w:noProof/>
               </w:rPr>
-              <w:t>1</w:t>
+              <w:t>15</w:t>
             </w:r>
             <w:r>
               <w:rPr>
@@ -3217,7 +3211,7 @@
               <w:rPr>
                 <w:noProof/>
               </w:rPr>
-              <w:t>1</w:t>
+              <w:t>15</w:t>
             </w:r>
             <w:r>
               <w:rPr>
@@ -3278,7 +3272,7 @@
               <w:rPr>
                 <w:noProof/>
               </w:rPr>
-              <w:t>1</w:t>
+              <w:t>15</w:t>
             </w:r>
             <w:r>
               <w:rPr>
@@ -3339,7 +3333,7 @@
               <w:rPr>
                 <w:noProof/>
               </w:rPr>
-              <w:t>1</w:t>
+              <w:t>15</w:t>
             </w:r>
             <w:r>
               <w:rPr>
@@ -3400,7 +3394,7 @@
               <w:rPr>
                 <w:noProof/>
               </w:rPr>
-              <w:t>1</w:t>
+              <w:t>15</w:t>
             </w:r>
             <w:r>
               <w:rPr>
@@ -3461,7 +3455,7 @@
               <w:rPr>
                 <w:noProof/>
               </w:rPr>
-              <w:t>1</w:t>
+              <w:t>15</w:t>
             </w:r>
             <w:r>
               <w:rPr>
@@ -3522,7 +3516,7 @@
               <w:rPr>
                 <w:noProof/>
               </w:rPr>
-              <w:t>1</w:t>
+              <w:t>16</w:t>
             </w:r>
             <w:r>
               <w:rPr>
@@ -3583,7 +3577,7 @@
               <w:rPr>
                 <w:noProof/>
               </w:rPr>
-              <w:t>1</w:t>
+              <w:t>16</w:t>
             </w:r>
             <w:r>
               <w:rPr>
@@ -3644,7 +3638,7 @@
               <w:rPr>
                 <w:noProof/>
               </w:rPr>
-              <w:t>1</w:t>
+              <w:t>16</w:t>
             </w:r>
             <w:r>
               <w:rPr>
@@ -3705,7 +3699,7 @@
               <w:rPr>
                 <w:noProof/>
               </w:rPr>
-              <w:t>1</w:t>
+              <w:t>16</w:t>
             </w:r>
             <w:r>
               <w:rPr>
@@ -3766,7 +3760,7 @@
               <w:rPr>
                 <w:noProof/>
               </w:rPr>
-              <w:t>1</w:t>
+              <w:t>17</w:t>
             </w:r>
             <w:r>
               <w:rPr>
@@ -3827,7 +3821,7 @@
               <w:rPr>
                 <w:noProof/>
               </w:rPr>
-              <w:t>1</w:t>
+              <w:t>18</w:t>
             </w:r>
             <w:r>
               <w:rPr>
@@ -3888,7 +3882,7 @@
               <w:rPr>
                 <w:noProof/>
               </w:rPr>
-              <w:t>1</w:t>
+              <w:t>18</w:t>
             </w:r>
             <w:r>
               <w:rPr>
@@ -4102,12 +4096,6 @@
         <w:gridCol w:w="3005"/>
       </w:tblGrid>
       <w:tr>
-        <w:tblPrEx>
-          <w:tblCellMar>
-            <w:top w:w="0" w:type="dxa"/>
-            <w:bottom w:w="0" w:type="dxa"/>
-          </w:tblCellMar>
-        </w:tblPrEx>
         <w:trPr>
           <w:tblHeader/>
         </w:trPr>
@@ -4182,12 +4170,6 @@
         </w:tc>
       </w:tr>
       <w:tr>
-        <w:tblPrEx>
-          <w:tblCellMar>
-            <w:top w:w="0" w:type="dxa"/>
-            <w:bottom w:w="0" w:type="dxa"/>
-          </w:tblCellMar>
-        </w:tblPrEx>
         <w:tc>
           <w:tcPr>
             <w:tcW w:w="3120" w:type="dxa"/>
@@ -4250,12 +4232,6 @@
         </w:tc>
       </w:tr>
       <w:tr>
-        <w:tblPrEx>
-          <w:tblCellMar>
-            <w:top w:w="0" w:type="dxa"/>
-            <w:bottom w:w="0" w:type="dxa"/>
-          </w:tblCellMar>
-        </w:tblPrEx>
         <w:tc>
           <w:tcPr>
             <w:tcW w:w="3120" w:type="dxa"/>
@@ -4327,12 +4303,6 @@
         </w:tc>
       </w:tr>
       <w:tr>
-        <w:tblPrEx>
-          <w:tblCellMar>
-            <w:top w:w="0" w:type="dxa"/>
-            <w:bottom w:w="0" w:type="dxa"/>
-          </w:tblCellMar>
-        </w:tblPrEx>
         <w:tc>
           <w:tcPr>
             <w:tcW w:w="3120" w:type="dxa"/>
@@ -4474,7 +4444,27 @@
           <w:sz w:val="20"/>
           <w:szCs w:val="20"/>
         </w:rPr>
-        <w:t>confidence = min(1.0, (</w:t>
+        <w:t xml:space="preserve">confidence = </w:t>
+      </w:r>
+      <w:proofErr w:type="gramStart"/>
+      <w:r>
+        <w:rPr>
+          <w:i/>
+          <w:iCs/>
+          <w:sz w:val="20"/>
+          <w:szCs w:val="20"/>
+        </w:rPr>
+        <w:t>min(</w:t>
+      </w:r>
+      <w:proofErr w:type="gramEnd"/>
+      <w:r>
+        <w:rPr>
+          <w:i/>
+          <w:iCs/>
+          <w:sz w:val="20"/>
+          <w:szCs w:val="20"/>
+        </w:rPr>
+        <w:t>1.0, (</w:t>
       </w:r>
       <w:proofErr w:type="spellStart"/>
       <w:r>
@@ -4789,7 +4779,15 @@
         <w:spacing w:after="120"/>
       </w:pPr>
       <w:r>
-        <w:t>The system does NOT verify that a pothole actually exists at any reported location, does NOT provide legally defensible evidence of road conditions, does NOT guarantee accuracy under adversarial conditions, does NOT replace professional road surveys or inspections, and does NOT establish source independence—only device diversity.</w:t>
+        <w:t xml:space="preserve">The system does NOT verify that a pothole </w:t>
+      </w:r>
+      <w:proofErr w:type="gramStart"/>
+      <w:r>
+        <w:t>actually exists</w:t>
+      </w:r>
+      <w:proofErr w:type="gramEnd"/>
+      <w:r>
+        <w:t xml:space="preserve"> at any reported location, does NOT provide legally defensible evidence of road conditions, does NOT guarantee accuracy under adversarial conditions, does NOT replace professional road surveys or inspections, and does NOT establish source independence—only device diversity.</w:t>
       </w:r>
     </w:p>
     <w:p>
@@ -5030,12 +5028,6 @@
         <w:gridCol w:w="2250"/>
       </w:tblGrid>
       <w:tr>
-        <w:tblPrEx>
-          <w:tblCellMar>
-            <w:top w:w="0" w:type="dxa"/>
-            <w:bottom w:w="0" w:type="dxa"/>
-          </w:tblCellMar>
-        </w:tblPrEx>
         <w:trPr>
           <w:tblHeader/>
         </w:trPr>
@@ -5133,12 +5125,6 @@
         </w:tc>
       </w:tr>
       <w:tr>
-        <w:tblPrEx>
-          <w:tblCellMar>
-            <w:top w:w="0" w:type="dxa"/>
-            <w:bottom w:w="0" w:type="dxa"/>
-          </w:tblCellMar>
-        </w:tblPrEx>
         <w:tc>
           <w:tcPr>
             <w:tcW w:w="2340" w:type="dxa"/>
@@ -5237,12 +5223,6 @@
         </w:tc>
       </w:tr>
       <w:tr>
-        <w:tblPrEx>
-          <w:tblCellMar>
-            <w:top w:w="0" w:type="dxa"/>
-            <w:bottom w:w="0" w:type="dxa"/>
-          </w:tblCellMar>
-        </w:tblPrEx>
         <w:tc>
           <w:tcPr>
             <w:tcW w:w="2340" w:type="dxa"/>
@@ -5325,12 +5305,6 @@
         </w:tc>
       </w:tr>
       <w:tr>
-        <w:tblPrEx>
-          <w:tblCellMar>
-            <w:top w:w="0" w:type="dxa"/>
-            <w:bottom w:w="0" w:type="dxa"/>
-          </w:tblCellMar>
-        </w:tblPrEx>
         <w:tc>
           <w:tcPr>
             <w:tcW w:w="2340" w:type="dxa"/>
@@ -5413,12 +5387,6 @@
         </w:tc>
       </w:tr>
       <w:tr>
-        <w:tblPrEx>
-          <w:tblCellMar>
-            <w:top w:w="0" w:type="dxa"/>
-            <w:bottom w:w="0" w:type="dxa"/>
-          </w:tblCellMar>
-        </w:tblPrEx>
         <w:tc>
           <w:tcPr>
             <w:tcW w:w="2340" w:type="dxa"/>
@@ -5739,12 +5707,6 @@
         <w:gridCol w:w="3012"/>
       </w:tblGrid>
       <w:tr>
-        <w:tblPrEx>
-          <w:tblCellMar>
-            <w:top w:w="0" w:type="dxa"/>
-            <w:bottom w:w="0" w:type="dxa"/>
-          </w:tblCellMar>
-        </w:tblPrEx>
         <w:trPr>
           <w:tblHeader/>
         </w:trPr>
@@ -5819,12 +5781,6 @@
         </w:tc>
       </w:tr>
       <w:tr>
-        <w:tblPrEx>
-          <w:tblCellMar>
-            <w:top w:w="0" w:type="dxa"/>
-            <w:bottom w:w="0" w:type="dxa"/>
-          </w:tblCellMar>
-        </w:tblPrEx>
         <w:tc>
           <w:tcPr>
             <w:tcW w:w="3120" w:type="dxa"/>
@@ -5887,12 +5843,6 @@
         </w:tc>
       </w:tr>
       <w:tr>
-        <w:tblPrEx>
-          <w:tblCellMar>
-            <w:top w:w="0" w:type="dxa"/>
-            <w:bottom w:w="0" w:type="dxa"/>
-          </w:tblCellMar>
-        </w:tblPrEx>
         <w:tc>
           <w:tcPr>
             <w:tcW w:w="3120" w:type="dxa"/>
@@ -5955,12 +5905,6 @@
         </w:tc>
       </w:tr>
       <w:tr>
-        <w:tblPrEx>
-          <w:tblCellMar>
-            <w:top w:w="0" w:type="dxa"/>
-            <w:bottom w:w="0" w:type="dxa"/>
-          </w:tblCellMar>
-        </w:tblPrEx>
         <w:tc>
           <w:tcPr>
             <w:tcW w:w="3120" w:type="dxa"/>
@@ -6023,12 +5967,6 @@
         </w:tc>
       </w:tr>
       <w:tr>
-        <w:tblPrEx>
-          <w:tblCellMar>
-            <w:top w:w="0" w:type="dxa"/>
-            <w:bottom w:w="0" w:type="dxa"/>
-          </w:tblCellMar>
-        </w:tblPrEx>
         <w:tc>
           <w:tcPr>
             <w:tcW w:w="3120" w:type="dxa"/>
@@ -6091,12 +6029,6 @@
         </w:tc>
       </w:tr>
       <w:tr>
-        <w:tblPrEx>
-          <w:tblCellMar>
-            <w:top w:w="0" w:type="dxa"/>
-            <w:bottom w:w="0" w:type="dxa"/>
-          </w:tblCellMar>
-        </w:tblPrEx>
         <w:tc>
           <w:tcPr>
             <w:tcW w:w="3120" w:type="dxa"/>
@@ -6252,6 +6184,7 @@
         <w:spacing w:after="200"/>
         <w:ind w:left="720"/>
       </w:pPr>
+      <w:proofErr w:type="gramStart"/>
       <w:r>
         <w:rPr>
           <w:rFonts w:ascii="Courier New" w:eastAsia="Courier New" w:hAnsi="Courier New" w:cs="Courier New"/>
@@ -6261,6 +6194,7 @@
         <w:t>{ "</w:t>
       </w:r>
       <w:proofErr w:type="spellStart"/>
+      <w:proofErr w:type="gramEnd"/>
       <w:r>
         <w:rPr>
           <w:rFonts w:ascii="Courier New" w:eastAsia="Courier New" w:hAnsi="Courier New" w:cs="Courier New"/>
@@ -6330,8 +6264,18 @@
           <w:sz w:val="20"/>
           <w:szCs w:val="20"/>
         </w:rPr>
-        <w:t>": 0.25 }</w:t>
-      </w:r>
+        <w:t xml:space="preserve">": </w:t>
+      </w:r>
+      <w:proofErr w:type="gramStart"/>
+      <w:r>
+        <w:rPr>
+          <w:rFonts w:ascii="Courier New" w:eastAsia="Courier New" w:hAnsi="Courier New" w:cs="Courier New"/>
+          <w:sz w:val="20"/>
+          <w:szCs w:val="20"/>
+        </w:rPr>
+        <w:t>0.25 }</w:t>
+      </w:r>
+      <w:proofErr w:type="gramEnd"/>
     </w:p>
     <w:p>
       <w:r>
@@ -6391,12 +6335,6 @@
         <w:gridCol w:w="2261"/>
       </w:tblGrid>
       <w:tr>
-        <w:tblPrEx>
-          <w:tblCellMar>
-            <w:top w:w="0" w:type="dxa"/>
-            <w:bottom w:w="0" w:type="dxa"/>
-          </w:tblCellMar>
-        </w:tblPrEx>
         <w:trPr>
           <w:tblHeader/>
         </w:trPr>
@@ -6494,12 +6432,6 @@
         </w:tc>
       </w:tr>
       <w:tr>
-        <w:tblPrEx>
-          <w:tblCellMar>
-            <w:top w:w="0" w:type="dxa"/>
-            <w:bottom w:w="0" w:type="dxa"/>
-          </w:tblCellMar>
-        </w:tblPrEx>
         <w:tc>
           <w:tcPr>
             <w:tcW w:w="2340" w:type="dxa"/>
@@ -6582,12 +6514,6 @@
         </w:tc>
       </w:tr>
       <w:tr>
-        <w:tblPrEx>
-          <w:tblCellMar>
-            <w:top w:w="0" w:type="dxa"/>
-            <w:bottom w:w="0" w:type="dxa"/>
-          </w:tblCellMar>
-        </w:tblPrEx>
         <w:tc>
           <w:tcPr>
             <w:tcW w:w="2340" w:type="dxa"/>
@@ -6670,12 +6596,6 @@
         </w:tc>
       </w:tr>
       <w:tr>
-        <w:tblPrEx>
-          <w:tblCellMar>
-            <w:top w:w="0" w:type="dxa"/>
-            <w:bottom w:w="0" w:type="dxa"/>
-          </w:tblCellMar>
-        </w:tblPrEx>
         <w:tc>
           <w:tcPr>
             <w:tcW w:w="2340" w:type="dxa"/>
@@ -6847,12 +6767,6 @@
         <w:gridCol w:w="3018"/>
       </w:tblGrid>
       <w:tr>
-        <w:tblPrEx>
-          <w:tblCellMar>
-            <w:top w:w="0" w:type="dxa"/>
-            <w:bottom w:w="0" w:type="dxa"/>
-          </w:tblCellMar>
-        </w:tblPrEx>
         <w:trPr>
           <w:tblHeader/>
         </w:trPr>
@@ -6927,12 +6841,6 @@
         </w:tc>
       </w:tr>
       <w:tr>
-        <w:tblPrEx>
-          <w:tblCellMar>
-            <w:top w:w="0" w:type="dxa"/>
-            <w:bottom w:w="0" w:type="dxa"/>
-          </w:tblCellMar>
-        </w:tblPrEx>
         <w:tc>
           <w:tcPr>
             <w:tcW w:w="3120" w:type="dxa"/>
@@ -6995,12 +6903,6 @@
         </w:tc>
       </w:tr>
       <w:tr>
-        <w:tblPrEx>
-          <w:tblCellMar>
-            <w:top w:w="0" w:type="dxa"/>
-            <w:bottom w:w="0" w:type="dxa"/>
-          </w:tblCellMar>
-        </w:tblPrEx>
         <w:tc>
           <w:tcPr>
             <w:tcW w:w="3120" w:type="dxa"/>
@@ -7063,12 +6965,6 @@
         </w:tc>
       </w:tr>
       <w:tr>
-        <w:tblPrEx>
-          <w:tblCellMar>
-            <w:top w:w="0" w:type="dxa"/>
-            <w:bottom w:w="0" w:type="dxa"/>
-          </w:tblCellMar>
-        </w:tblPrEx>
         <w:tc>
           <w:tcPr>
             <w:tcW w:w="3120" w:type="dxa"/>
@@ -7131,12 +7027,6 @@
         </w:tc>
       </w:tr>
       <w:tr>
-        <w:tblPrEx>
-          <w:tblCellMar>
-            <w:top w:w="0" w:type="dxa"/>
-            <w:bottom w:w="0" w:type="dxa"/>
-          </w:tblCellMar>
-        </w:tblPrEx>
         <w:tc>
           <w:tcPr>
             <w:tcW w:w="3120" w:type="dxa"/>
@@ -7280,12 +7170,6 @@
         <w:gridCol w:w="3013"/>
       </w:tblGrid>
       <w:tr>
-        <w:tblPrEx>
-          <w:tblCellMar>
-            <w:top w:w="0" w:type="dxa"/>
-            <w:bottom w:w="0" w:type="dxa"/>
-          </w:tblCellMar>
-        </w:tblPrEx>
         <w:trPr>
           <w:tblHeader/>
         </w:trPr>
@@ -7360,12 +7244,6 @@
         </w:tc>
       </w:tr>
       <w:tr>
-        <w:tblPrEx>
-          <w:tblCellMar>
-            <w:top w:w="0" w:type="dxa"/>
-            <w:bottom w:w="0" w:type="dxa"/>
-          </w:tblCellMar>
-        </w:tblPrEx>
         <w:tc>
           <w:tcPr>
             <w:tcW w:w="3120" w:type="dxa"/>
@@ -7428,12 +7306,6 @@
         </w:tc>
       </w:tr>
       <w:tr>
-        <w:tblPrEx>
-          <w:tblCellMar>
-            <w:top w:w="0" w:type="dxa"/>
-            <w:bottom w:w="0" w:type="dxa"/>
-          </w:tblCellMar>
-        </w:tblPrEx>
         <w:tc>
           <w:tcPr>
             <w:tcW w:w="3120" w:type="dxa"/>
@@ -7496,12 +7368,6 @@
         </w:tc>
       </w:tr>
       <w:tr>
-        <w:tblPrEx>
-          <w:tblCellMar>
-            <w:top w:w="0" w:type="dxa"/>
-            <w:bottom w:w="0" w:type="dxa"/>
-          </w:tblCellMar>
-        </w:tblPrEx>
         <w:tc>
           <w:tcPr>
             <w:tcW w:w="3120" w:type="dxa"/>
@@ -7564,12 +7430,6 @@
         </w:tc>
       </w:tr>
       <w:tr>
-        <w:tblPrEx>
-          <w:tblCellMar>
-            <w:top w:w="0" w:type="dxa"/>
-            <w:bottom w:w="0" w:type="dxa"/>
-          </w:tblCellMar>
-        </w:tblPrEx>
         <w:tc>
           <w:tcPr>
             <w:tcW w:w="3120" w:type="dxa"/>
@@ -7802,12 +7662,6 @@
         <w:gridCol w:w="3029"/>
       </w:tblGrid>
       <w:tr>
-        <w:tblPrEx>
-          <w:tblCellMar>
-            <w:top w:w="0" w:type="dxa"/>
-            <w:bottom w:w="0" w:type="dxa"/>
-          </w:tblCellMar>
-        </w:tblPrEx>
         <w:trPr>
           <w:tblHeader/>
         </w:trPr>
@@ -7882,12 +7736,6 @@
         </w:tc>
       </w:tr>
       <w:tr>
-        <w:tblPrEx>
-          <w:tblCellMar>
-            <w:top w:w="0" w:type="dxa"/>
-            <w:bottom w:w="0" w:type="dxa"/>
-          </w:tblCellMar>
-        </w:tblPrEx>
         <w:tc>
           <w:tcPr>
             <w:tcW w:w="3120" w:type="dxa"/>
@@ -7950,12 +7798,6 @@
         </w:tc>
       </w:tr>
       <w:tr>
-        <w:tblPrEx>
-          <w:tblCellMar>
-            <w:top w:w="0" w:type="dxa"/>
-            <w:bottom w:w="0" w:type="dxa"/>
-          </w:tblCellMar>
-        </w:tblPrEx>
         <w:tc>
           <w:tcPr>
             <w:tcW w:w="3120" w:type="dxa"/>
@@ -8018,12 +7860,6 @@
         </w:tc>
       </w:tr>
       <w:tr>
-        <w:tblPrEx>
-          <w:tblCellMar>
-            <w:top w:w="0" w:type="dxa"/>
-            <w:bottom w:w="0" w:type="dxa"/>
-          </w:tblCellMar>
-        </w:tblPrEx>
         <w:tc>
           <w:tcPr>
             <w:tcW w:w="3120" w:type="dxa"/>
@@ -8134,12 +7970,6 @@
         <w:gridCol w:w="2249"/>
       </w:tblGrid>
       <w:tr>
-        <w:tblPrEx>
-          <w:tblCellMar>
-            <w:top w:w="0" w:type="dxa"/>
-            <w:bottom w:w="0" w:type="dxa"/>
-          </w:tblCellMar>
-        </w:tblPrEx>
         <w:trPr>
           <w:tblHeader/>
         </w:trPr>
@@ -8237,12 +8067,6 @@
         </w:tc>
       </w:tr>
       <w:tr>
-        <w:tblPrEx>
-          <w:tblCellMar>
-            <w:top w:w="0" w:type="dxa"/>
-            <w:bottom w:w="0" w:type="dxa"/>
-          </w:tblCellMar>
-        </w:tblPrEx>
         <w:tc>
           <w:tcPr>
             <w:tcW w:w="2340" w:type="dxa"/>
@@ -8325,12 +8149,6 @@
         </w:tc>
       </w:tr>
       <w:tr>
-        <w:tblPrEx>
-          <w:tblCellMar>
-            <w:top w:w="0" w:type="dxa"/>
-            <w:bottom w:w="0" w:type="dxa"/>
-          </w:tblCellMar>
-        </w:tblPrEx>
         <w:tc>
           <w:tcPr>
             <w:tcW w:w="2340" w:type="dxa"/>
@@ -8429,12 +8247,6 @@
         </w:tc>
       </w:tr>
       <w:tr>
-        <w:tblPrEx>
-          <w:tblCellMar>
-            <w:top w:w="0" w:type="dxa"/>
-            <w:bottom w:w="0" w:type="dxa"/>
-          </w:tblCellMar>
-        </w:tblPrEx>
         <w:tc>
           <w:tcPr>
             <w:tcW w:w="2340" w:type="dxa"/>
@@ -8595,7 +8407,27 @@
           <w:sz w:val="20"/>
           <w:szCs w:val="20"/>
         </w:rPr>
-        <w:t>confidence = min(1.0, (</w:t>
+        <w:t xml:space="preserve">confidence = </w:t>
+      </w:r>
+      <w:proofErr w:type="gramStart"/>
+      <w:r>
+        <w:rPr>
+          <w:i/>
+          <w:iCs/>
+          <w:sz w:val="20"/>
+          <w:szCs w:val="20"/>
+        </w:rPr>
+        <w:t>min(</w:t>
+      </w:r>
+      <w:proofErr w:type="gramEnd"/>
+      <w:r>
+        <w:rPr>
+          <w:i/>
+          <w:iCs/>
+          <w:sz w:val="20"/>
+          <w:szCs w:val="20"/>
+        </w:rPr>
+        <w:t>1.0, (</w:t>
       </w:r>
       <w:proofErr w:type="spellStart"/>
       <w:r>
@@ -8671,12 +8503,6 @@
         <w:gridCol w:w="3005"/>
       </w:tblGrid>
       <w:tr>
-        <w:tblPrEx>
-          <w:tblCellMar>
-            <w:top w:w="0" w:type="dxa"/>
-            <w:bottom w:w="0" w:type="dxa"/>
-          </w:tblCellMar>
-        </w:tblPrEx>
         <w:trPr>
           <w:tblHeader/>
         </w:trPr>
@@ -8751,12 +8577,6 @@
         </w:tc>
       </w:tr>
       <w:tr>
-        <w:tblPrEx>
-          <w:tblCellMar>
-            <w:top w:w="0" w:type="dxa"/>
-            <w:bottom w:w="0" w:type="dxa"/>
-          </w:tblCellMar>
-        </w:tblPrEx>
         <w:tc>
           <w:tcPr>
             <w:tcW w:w="3120" w:type="dxa"/>
@@ -8819,12 +8639,6 @@
         </w:tc>
       </w:tr>
       <w:tr>
-        <w:tblPrEx>
-          <w:tblCellMar>
-            <w:top w:w="0" w:type="dxa"/>
-            <w:bottom w:w="0" w:type="dxa"/>
-          </w:tblCellMar>
-        </w:tblPrEx>
         <w:tc>
           <w:tcPr>
             <w:tcW w:w="3120" w:type="dxa"/>
@@ -8887,12 +8701,6 @@
         </w:tc>
       </w:tr>
       <w:tr>
-        <w:tblPrEx>
-          <w:tblCellMar>
-            <w:top w:w="0" w:type="dxa"/>
-            <w:bottom w:w="0" w:type="dxa"/>
-          </w:tblCellMar>
-        </w:tblPrEx>
         <w:tc>
           <w:tcPr>
             <w:tcW w:w="3120" w:type="dxa"/>
@@ -8955,12 +8763,6 @@
         </w:tc>
       </w:tr>
       <w:tr>
-        <w:tblPrEx>
-          <w:tblCellMar>
-            <w:top w:w="0" w:type="dxa"/>
-            <w:bottom w:w="0" w:type="dxa"/>
-          </w:tblCellMar>
-        </w:tblPrEx>
         <w:tc>
           <w:tcPr>
             <w:tcW w:w="3120" w:type="dxa"/>
@@ -9187,12 +8989,6 @@
         <w:gridCol w:w="4503"/>
       </w:tblGrid>
       <w:tr>
-        <w:tblPrEx>
-          <w:tblCellMar>
-            <w:top w:w="0" w:type="dxa"/>
-            <w:bottom w:w="0" w:type="dxa"/>
-          </w:tblCellMar>
-        </w:tblPrEx>
         <w:trPr>
           <w:tblHeader/>
         </w:trPr>
@@ -9244,12 +9040,6 @@
         </w:tc>
       </w:tr>
       <w:tr>
-        <w:tblPrEx>
-          <w:tblCellMar>
-            <w:top w:w="0" w:type="dxa"/>
-            <w:bottom w:w="0" w:type="dxa"/>
-          </w:tblCellMar>
-        </w:tblPrEx>
         <w:tc>
           <w:tcPr>
             <w:tcW w:w="4680" w:type="dxa"/>
@@ -9292,12 +9082,6 @@
         </w:tc>
       </w:tr>
       <w:tr>
-        <w:tblPrEx>
-          <w:tblCellMar>
-            <w:top w:w="0" w:type="dxa"/>
-            <w:bottom w:w="0" w:type="dxa"/>
-          </w:tblCellMar>
-        </w:tblPrEx>
         <w:tc>
           <w:tcPr>
             <w:tcW w:w="4680" w:type="dxa"/>
@@ -9340,12 +9124,6 @@
         </w:tc>
       </w:tr>
       <w:tr>
-        <w:tblPrEx>
-          <w:tblCellMar>
-            <w:top w:w="0" w:type="dxa"/>
-            <w:bottom w:w="0" w:type="dxa"/>
-          </w:tblCellMar>
-        </w:tblPrEx>
         <w:tc>
           <w:tcPr>
             <w:tcW w:w="4680" w:type="dxa"/>
@@ -9388,12 +9166,6 @@
         </w:tc>
       </w:tr>
       <w:tr>
-        <w:tblPrEx>
-          <w:tblCellMar>
-            <w:top w:w="0" w:type="dxa"/>
-            <w:bottom w:w="0" w:type="dxa"/>
-          </w:tblCellMar>
-        </w:tblPrEx>
         <w:tc>
           <w:tcPr>
             <w:tcW w:w="4680" w:type="dxa"/>
@@ -9530,12 +9302,6 @@
         <w:gridCol w:w="2994"/>
       </w:tblGrid>
       <w:tr>
-        <w:tblPrEx>
-          <w:tblCellMar>
-            <w:top w:w="0" w:type="dxa"/>
-            <w:bottom w:w="0" w:type="dxa"/>
-          </w:tblCellMar>
-        </w:tblPrEx>
         <w:trPr>
           <w:tblHeader/>
         </w:trPr>
@@ -9610,12 +9376,6 @@
         </w:tc>
       </w:tr>
       <w:tr>
-        <w:tblPrEx>
-          <w:tblCellMar>
-            <w:top w:w="0" w:type="dxa"/>
-            <w:bottom w:w="0" w:type="dxa"/>
-          </w:tblCellMar>
-        </w:tblPrEx>
         <w:tc>
           <w:tcPr>
             <w:tcW w:w="3120" w:type="dxa"/>
@@ -9678,12 +9438,6 @@
         </w:tc>
       </w:tr>
       <w:tr>
-        <w:tblPrEx>
-          <w:tblCellMar>
-            <w:top w:w="0" w:type="dxa"/>
-            <w:bottom w:w="0" w:type="dxa"/>
-          </w:tblCellMar>
-        </w:tblPrEx>
         <w:tc>
           <w:tcPr>
             <w:tcW w:w="3120" w:type="dxa"/>
@@ -9746,12 +9500,6 @@
         </w:tc>
       </w:tr>
       <w:tr>
-        <w:tblPrEx>
-          <w:tblCellMar>
-            <w:top w:w="0" w:type="dxa"/>
-            <w:bottom w:w="0" w:type="dxa"/>
-          </w:tblCellMar>
-        </w:tblPrEx>
         <w:tc>
           <w:tcPr>
             <w:tcW w:w="3120" w:type="dxa"/>
@@ -9814,12 +9562,6 @@
         </w:tc>
       </w:tr>
       <w:tr>
-        <w:tblPrEx>
-          <w:tblCellMar>
-            <w:top w:w="0" w:type="dxa"/>
-            <w:bottom w:w="0" w:type="dxa"/>
-          </w:tblCellMar>
-        </w:tblPrEx>
         <w:tc>
           <w:tcPr>
             <w:tcW w:w="3120" w:type="dxa"/>
@@ -9960,7 +9702,15 @@
         </w:numPr>
       </w:pPr>
       <w:r>
-        <w:t>Layer includes: cluster centroid, confidence score, report count, last update, status</w:t>
+        <w:t xml:space="preserve">Layer </w:t>
+      </w:r>
+      <w:proofErr w:type="gramStart"/>
+      <w:r>
+        <w:t>includes:</w:t>
+      </w:r>
+      <w:proofErr w:type="gramEnd"/>
+      <w:r>
+        <w:t xml:space="preserve"> cluster centroid, confidence score, report count, last update, status</w:t>
       </w:r>
     </w:p>
     <w:p>
@@ -10272,12 +10022,6 @@
         <w:gridCol w:w="5993"/>
       </w:tblGrid>
       <w:tr>
-        <w:tblPrEx>
-          <w:tblCellMar>
-            <w:top w:w="0" w:type="dxa"/>
-            <w:bottom w:w="0" w:type="dxa"/>
-          </w:tblCellMar>
-        </w:tblPrEx>
         <w:tc>
           <w:tcPr>
             <w:tcW w:w="3120" w:type="dxa"/>
@@ -10316,12 +10060,6 @@
         </w:tc>
       </w:tr>
       <w:tr>
-        <w:tblPrEx>
-          <w:tblCellMar>
-            <w:top w:w="0" w:type="dxa"/>
-            <w:bottom w:w="0" w:type="dxa"/>
-          </w:tblCellMar>
-        </w:tblPrEx>
         <w:tc>
           <w:tcPr>
             <w:tcW w:w="3120" w:type="dxa"/>
@@ -10360,12 +10098,6 @@
         </w:tc>
       </w:tr>
       <w:tr>
-        <w:tblPrEx>
-          <w:tblCellMar>
-            <w:top w:w="0" w:type="dxa"/>
-            <w:bottom w:w="0" w:type="dxa"/>
-          </w:tblCellMar>
-        </w:tblPrEx>
         <w:tc>
           <w:tcPr>
             <w:tcW w:w="3120" w:type="dxa"/>
@@ -10404,12 +10136,6 @@
         </w:tc>
       </w:tr>
       <w:tr>
-        <w:tblPrEx>
-          <w:tblCellMar>
-            <w:top w:w="0" w:type="dxa"/>
-            <w:bottom w:w="0" w:type="dxa"/>
-          </w:tblCellMar>
-        </w:tblPrEx>
         <w:tc>
           <w:tcPr>
             <w:tcW w:w="3120" w:type="dxa"/>
@@ -10448,12 +10174,6 @@
         </w:tc>
       </w:tr>
       <w:tr>
-        <w:tblPrEx>
-          <w:tblCellMar>
-            <w:top w:w="0" w:type="dxa"/>
-            <w:bottom w:w="0" w:type="dxa"/>
-          </w:tblCellMar>
-        </w:tblPrEx>
         <w:tc>
           <w:tcPr>
             <w:tcW w:w="3120" w:type="dxa"/>
@@ -10492,12 +10212,6 @@
         </w:tc>
       </w:tr>
       <w:tr>
-        <w:tblPrEx>
-          <w:tblCellMar>
-            <w:top w:w="0" w:type="dxa"/>
-            <w:bottom w:w="0" w:type="dxa"/>
-          </w:tblCellMar>
-        </w:tblPrEx>
         <w:tc>
           <w:tcPr>
             <w:tcW w:w="3120" w:type="dxa"/>
@@ -10536,12 +10250,6 @@
         </w:tc>
       </w:tr>
       <w:tr>
-        <w:tblPrEx>
-          <w:tblCellMar>
-            <w:top w:w="0" w:type="dxa"/>
-            <w:bottom w:w="0" w:type="dxa"/>
-          </w:tblCellMar>
-        </w:tblPrEx>
         <w:tc>
           <w:tcPr>
             <w:tcW w:w="3120" w:type="dxa"/>
@@ -10580,12 +10288,6 @@
         </w:tc>
       </w:tr>
       <w:tr>
-        <w:tblPrEx>
-          <w:tblCellMar>
-            <w:top w:w="0" w:type="dxa"/>
-            <w:bottom w:w="0" w:type="dxa"/>
-          </w:tblCellMar>
-        </w:tblPrEx>
         <w:tc>
           <w:tcPr>
             <w:tcW w:w="3120" w:type="dxa"/>
@@ -10624,12 +10326,6 @@
         </w:tc>
       </w:tr>
       <w:tr>
-        <w:tblPrEx>
-          <w:tblCellMar>
-            <w:top w:w="0" w:type="dxa"/>
-            <w:bottom w:w="0" w:type="dxa"/>
-          </w:tblCellMar>
-        </w:tblPrEx>
         <w:tc>
           <w:tcPr>
             <w:tcW w:w="3120" w:type="dxa"/>
@@ -10668,12 +10364,6 @@
         </w:tc>
       </w:tr>
       <w:tr>
-        <w:tblPrEx>
-          <w:tblCellMar>
-            <w:top w:w="0" w:type="dxa"/>
-            <w:bottom w:w="0" w:type="dxa"/>
-          </w:tblCellMar>
-        </w:tblPrEx>
         <w:tc>
           <w:tcPr>
             <w:tcW w:w="3120" w:type="dxa"/>
@@ -10755,12 +10445,6 @@
         <w:gridCol w:w="5252"/>
       </w:tblGrid>
       <w:tr>
-        <w:tblPrEx>
-          <w:tblCellMar>
-            <w:top w:w="0" w:type="dxa"/>
-            <w:bottom w:w="0" w:type="dxa"/>
-          </w:tblCellMar>
-        </w:tblPrEx>
         <w:trPr>
           <w:tblHeader/>
         </w:trPr>
@@ -10835,12 +10519,6 @@
         </w:tc>
       </w:tr>
       <w:tr>
-        <w:tblPrEx>
-          <w:tblCellMar>
-            <w:top w:w="0" w:type="dxa"/>
-            <w:bottom w:w="0" w:type="dxa"/>
-          </w:tblCellMar>
-        </w:tblPrEx>
         <w:tc>
           <w:tcPr>
             <w:tcW w:w="1560" w:type="dxa"/>
@@ -10905,12 +10583,6 @@
         </w:tc>
       </w:tr>
       <w:tr>
-        <w:tblPrEx>
-          <w:tblCellMar>
-            <w:top w:w="0" w:type="dxa"/>
-            <w:bottom w:w="0" w:type="dxa"/>
-          </w:tblCellMar>
-        </w:tblPrEx>
         <w:tc>
           <w:tcPr>
             <w:tcW w:w="1560" w:type="dxa"/>
@@ -10973,12 +10645,6 @@
         </w:tc>
       </w:tr>
       <w:tr>
-        <w:tblPrEx>
-          <w:tblCellMar>
-            <w:top w:w="0" w:type="dxa"/>
-            <w:bottom w:w="0" w:type="dxa"/>
-          </w:tblCellMar>
-        </w:tblPrEx>
         <w:tc>
           <w:tcPr>
             <w:tcW w:w="1560" w:type="dxa"/>

</xml_diff>

<commit_message>
Remove CONFIDENTIAL header, regenerate PDF
Co-Authored-By: Claude Sonnet 4.6 <noreply@anthropic.com>
</commit_message>
<xml_diff>
--- a/PotholeWatch_White_Paper_v8_Final.docx
+++ b/PotholeWatch_White_Paper_v8_Final.docx
@@ -10899,14 +10899,6 @@
     <w:pPr>
       <w:jc w:val="right"/>
     </w:pPr>
-    <w:r>
-      <w:rPr>
-        <w:color w:val="666666"/>
-        <w:sz w:val="18"/>
-        <w:szCs w:val="18"/>
-      </w:rPr>
-      <w:t>CONFIDENTIAL</w:t>
-    </w:r>
   </w:p>
 </w:hdr>
 </file>

</xml_diff>